<commit_message>
edition of plan, notes and docs for tesis
</commit_message>
<xml_diff>
--- a/docs/tesis/Caratula-PLAN de tesis.docx
+++ b/docs/tesis/Caratula-PLAN de tesis.docx
@@ -258,7 +258,10 @@
         <w:jc w:val="center"/>
       </w:pPr>
       <w:r>
-        <w:t>Clasificación Arancelaria con NLP</w:t>
+        <w:t xml:space="preserve">Clasificación Arancelaria con </w:t>
+      </w:r>
+      <w:r>
+        <w:t>Procesamiento de Lenguaje Natural</w:t>
       </w:r>
     </w:p>
     <w:p>
@@ -423,7 +426,7 @@
         <w:rPr>
           <w:sz w:val="28"/>
           <w:szCs w:val="28"/>
-          <w:lang w:val="en-GB"/>
+          <w:lang w:val="es-AR"/>
         </w:rPr>
       </w:pPr>
       <w:r>
@@ -461,7 +464,7 @@
         <w:rPr>
           <w:sz w:val="28"/>
           <w:szCs w:val="28"/>
-          <w:lang w:val="en-GB"/>
+          <w:lang w:val="es-AR"/>
         </w:rPr>
         <w:t>Santiago S. Tedoldi</w:t>
       </w:r>
@@ -473,7 +476,7 @@
         <w:rPr>
           <w:sz w:val="28"/>
           <w:szCs w:val="28"/>
-          <w:lang w:val="en-GB"/>
+          <w:lang w:val="es-AR"/>
         </w:rPr>
       </w:pPr>
       <w:r>
@@ -481,7 +484,7 @@
           <w:b/>
           <w:sz w:val="28"/>
           <w:szCs w:val="28"/>
-          <w:lang w:val="en-GB"/>
+          <w:lang w:val="es-AR"/>
         </w:rPr>
         <w:t>Director</w:t>
       </w:r>
@@ -489,7 +492,7 @@
         <w:rPr>
           <w:sz w:val="28"/>
           <w:szCs w:val="28"/>
-          <w:lang w:val="en-GB"/>
+          <w:lang w:val="es-AR"/>
         </w:rPr>
         <w:t xml:space="preserve">: </w:t>
       </w:r>
@@ -497,7 +500,7 @@
         <w:rPr>
           <w:sz w:val="28"/>
           <w:szCs w:val="28"/>
-          <w:lang w:val="en-GB"/>
+          <w:lang w:val="es-AR"/>
         </w:rPr>
         <w:tab/>
       </w:r>
@@ -505,7 +508,7 @@
         <w:rPr>
           <w:sz w:val="28"/>
           <w:szCs w:val="28"/>
-          <w:lang w:val="en-GB"/>
+          <w:lang w:val="es-AR"/>
         </w:rPr>
         <w:tab/>
         <w:t xml:space="preserve">Dr. </w:t>
@@ -514,7 +517,7 @@
         <w:rPr>
           <w:sz w:val="28"/>
           <w:szCs w:val="28"/>
-          <w:lang w:val="en-GB"/>
+          <w:lang w:val="es-AR"/>
         </w:rPr>
         <w:t>Bruno Bianchi</w:t>
       </w:r>

</xml_diff>